<commit_message>
Removed tailwind from svelte 5
</commit_message>
<xml_diff>
--- a/svelte/cj-svelte-seo/project-docs/project-details.docx
+++ b/svelte/cj-svelte-seo/project-docs/project-details.docx
@@ -637,20 +637,15 @@
       </w:pPr>
       <w:r>
         <w:lastRenderedPageBreak/>
-        <w:t xml:space="preserve">Installing </w:t>
-      </w:r>
-      <w:proofErr w:type="spellStart"/>
-      <w:r>
-        <w:t>Pocketbase</w:t>
-      </w:r>
-      <w:proofErr w:type="spellEnd"/>
-    </w:p>
-    <w:p>
-      <w:pPr>
-        <w:pStyle w:val="ListParagraph"/>
-        <w:numPr>
-          <w:ilvl w:val="0"/>
-          <w:numId w:val="3"/>
+        <w:t>How to add tailwind in svelte project</w:t>
+      </w:r>
+    </w:p>
+    <w:p>
+      <w:pPr>
+        <w:pStyle w:val="ListParagraph"/>
+        <w:numPr>
+          <w:ilvl w:val="1"/>
+          <w:numId w:val="1"/>
         </w:numPr>
       </w:pPr>
       <w:proofErr w:type="spellStart"/>
@@ -659,13 +654,193 @@
       </w:r>
       <w:proofErr w:type="spellEnd"/>
       <w:r>
-        <w:t xml:space="preserve"> add </w:t>
-      </w:r>
-      <w:proofErr w:type="spellStart"/>
-      <w:r>
-        <w:t>pocketbase</w:t>
-      </w:r>
-      <w:proofErr w:type="spellEnd"/>
+        <w:t xml:space="preserve"> add -D </w:t>
+      </w:r>
+      <w:proofErr w:type="spellStart"/>
+      <w:r>
+        <w:t>tailwindcss</w:t>
+      </w:r>
+      <w:proofErr w:type="spellEnd"/>
+      <w:r>
+        <w:t xml:space="preserve"> </w:t>
+      </w:r>
+      <w:proofErr w:type="spellStart"/>
+      <w:r>
+        <w:t>postcss</w:t>
+      </w:r>
+      <w:proofErr w:type="spellEnd"/>
+      <w:r>
+        <w:t xml:space="preserve"> </w:t>
+      </w:r>
+      <w:proofErr w:type="spellStart"/>
+      <w:r>
+        <w:t>autoprefixer</w:t>
+      </w:r>
+      <w:proofErr w:type="spellEnd"/>
+    </w:p>
+    <w:p>
+      <w:pPr>
+        <w:pStyle w:val="ListParagraph"/>
+        <w:numPr>
+          <w:ilvl w:val="1"/>
+          <w:numId w:val="1"/>
+        </w:numPr>
+      </w:pPr>
+      <w:r>
+        <w:t xml:space="preserve">check the below link </w:t>
+      </w:r>
+    </w:p>
+    <w:p>
+      <w:pPr>
+        <w:pStyle w:val="ListParagraph"/>
+        <w:numPr>
+          <w:ilvl w:val="2"/>
+          <w:numId w:val="1"/>
+        </w:numPr>
+      </w:pPr>
+      <w:r>
+        <w:t xml:space="preserve">Add tailwind.css in </w:t>
+      </w:r>
+      <w:proofErr w:type="spellStart"/>
+      <w:r>
+        <w:t>src</w:t>
+      </w:r>
+      <w:proofErr w:type="spellEnd"/>
+      <w:r>
+        <w:t xml:space="preserve"> folder </w:t>
+      </w:r>
+    </w:p>
+    <w:p>
+      <w:pPr>
+        <w:pStyle w:val="ListParagraph"/>
+        <w:ind w:left="2880"/>
+      </w:pPr>
+      <w:r>
+        <w:drawing>
+          <wp:inline distT="0" distB="0" distL="0" distR="0" wp14:anchorId="7DEC1C8A" wp14:editId="66557C6B">
+            <wp:extent cx="2707215" cy="823935"/>
+            <wp:effectExtent l="0" t="0" r="0" b="0"/>
+            <wp:docPr id="591900064" name="Picture 1" descr="A screen shot of a computer code">
+              <a:extLst xmlns:a="http://schemas.openxmlformats.org/drawingml/2006/main">
+                <a:ext uri="{C183D7F6-B498-43B3-948B-1728B52AA6E4}">
+                  <adec:decorative xmlns:adec="http://schemas.microsoft.com/office/drawing/2017/decorative" val="0"/>
+                </a:ext>
+              </a:extLst>
+            </wp:docPr>
+            <wp:cNvGraphicFramePr>
+              <a:graphicFrameLocks xmlns:a="http://schemas.openxmlformats.org/drawingml/2006/main" noChangeAspect="1"/>
+            </wp:cNvGraphicFramePr>
+            <a:graphic xmlns:a="http://schemas.openxmlformats.org/drawingml/2006/main">
+              <a:graphicData uri="http://schemas.openxmlformats.org/drawingml/2006/picture">
+                <pic:pic xmlns:pic="http://schemas.openxmlformats.org/drawingml/2006/picture">
+                  <pic:nvPicPr>
+                    <pic:cNvPr id="591900064" name="Picture 1" descr="A screen shot of a computer code">
+                      <a:extLst>
+                        <a:ext uri="{C183D7F6-B498-43B3-948B-1728B52AA6E4}">
+                          <adec:decorative xmlns:adec="http://schemas.microsoft.com/office/drawing/2017/decorative" val="0"/>
+                        </a:ext>
+                      </a:extLst>
+                    </pic:cNvPr>
+                    <pic:cNvPicPr/>
+                  </pic:nvPicPr>
+                  <pic:blipFill>
+                    <a:blip r:embed="rId8"/>
+                    <a:stretch>
+                      <a:fillRect/>
+                    </a:stretch>
+                  </pic:blipFill>
+                  <pic:spPr>
+                    <a:xfrm>
+                      <a:off x="0" y="0"/>
+                      <a:ext cx="2726251" cy="829729"/>
+                    </a:xfrm>
+                    <a:prstGeom prst="rect">
+                      <a:avLst/>
+                    </a:prstGeom>
+                  </pic:spPr>
+                </pic:pic>
+              </a:graphicData>
+            </a:graphic>
+          </wp:inline>
+        </w:drawing>
+      </w:r>
+    </w:p>
+    <w:p>
+      <w:pPr>
+        <w:pStyle w:val="ListParagraph"/>
+        <w:numPr>
+          <w:ilvl w:val="2"/>
+          <w:numId w:val="1"/>
+        </w:numPr>
+      </w:pPr>
+      <w:r>
+        <w:t xml:space="preserve">In the </w:t>
+      </w:r>
+      <w:proofErr w:type="spellStart"/>
+      <w:proofErr w:type="gramStart"/>
+      <w:r>
+        <w:t>layout.svelte</w:t>
+      </w:r>
+      <w:proofErr w:type="spellEnd"/>
+      <w:proofErr w:type="gramEnd"/>
+      <w:r>
+        <w:t xml:space="preserve"> we need to import “../tailwind.css”</w:t>
+      </w:r>
+    </w:p>
+    <w:p>
+      <w:pPr>
+        <w:pStyle w:val="ListParagraph"/>
+        <w:numPr>
+          <w:ilvl w:val="2"/>
+          <w:numId w:val="1"/>
+        </w:numPr>
+      </w:pPr>
+      <w:r>
+        <w:t>Now you are ready to use the tailwind.css</w:t>
+      </w:r>
+    </w:p>
+    <w:p>
+      <w:pPr>
+        <w:pStyle w:val="ListParagraph"/>
+        <w:ind w:left="2160"/>
+      </w:pPr>
+      <w:r>
+        <w:drawing>
+          <wp:inline distT="0" distB="0" distL="0" distR="0" wp14:anchorId="571689CE" wp14:editId="7CE84ADE">
+            <wp:extent cx="4991100" cy="164237"/>
+            <wp:effectExtent l="0" t="0" r="0" b="7620"/>
+            <wp:docPr id="881016130" name="Picture 1"/>
+            <wp:cNvGraphicFramePr>
+              <a:graphicFrameLocks xmlns:a="http://schemas.openxmlformats.org/drawingml/2006/main" noChangeAspect="1"/>
+            </wp:cNvGraphicFramePr>
+            <a:graphic xmlns:a="http://schemas.openxmlformats.org/drawingml/2006/main">
+              <a:graphicData uri="http://schemas.openxmlformats.org/drawingml/2006/picture">
+                <pic:pic xmlns:pic="http://schemas.openxmlformats.org/drawingml/2006/picture">
+                  <pic:nvPicPr>
+                    <pic:cNvPr id="881016130" name=""/>
+                    <pic:cNvPicPr/>
+                  </pic:nvPicPr>
+                  <pic:blipFill>
+                    <a:blip r:embed="rId9"/>
+                    <a:stretch>
+                      <a:fillRect/>
+                    </a:stretch>
+                  </pic:blipFill>
+                  <pic:spPr>
+                    <a:xfrm>
+                      <a:off x="0" y="0"/>
+                      <a:ext cx="5196130" cy="170984"/>
+                    </a:xfrm>
+                    <a:prstGeom prst="rect">
+                      <a:avLst/>
+                    </a:prstGeom>
+                  </pic:spPr>
+                </pic:pic>
+              </a:graphicData>
+            </a:graphic>
+          </wp:inline>
+        </w:drawing>
+      </w:r>
     </w:p>
     <w:p>
       <w:pPr>
@@ -676,9 +851,207 @@
         </w:numPr>
       </w:pPr>
       <w:r>
-        <w:t>T</w:t>
-      </w:r>
-    </w:p>
+        <w:t xml:space="preserve">Counter </w:t>
+      </w:r>
+    </w:p>
+    <w:p>
+      <w:pPr>
+        <w:pStyle w:val="ListParagraph"/>
+        <w:numPr>
+          <w:ilvl w:val="1"/>
+          <w:numId w:val="1"/>
+        </w:numPr>
+      </w:pPr>
+      <w:r>
+        <w:t>How to declare state rune</w:t>
+      </w:r>
+    </w:p>
+    <w:p>
+      <w:pPr>
+        <w:pStyle w:val="ListParagraph"/>
+        <w:numPr>
+          <w:ilvl w:val="2"/>
+          <w:numId w:val="1"/>
+        </w:numPr>
+      </w:pPr>
+      <w:r>
+        <w:t>Let count = $</w:t>
+      </w:r>
+      <w:proofErr w:type="gramStart"/>
+      <w:r>
+        <w:t>state(</w:t>
+      </w:r>
+      <w:proofErr w:type="gramEnd"/>
+      <w:r>
+        <w:t>0);</w:t>
+      </w:r>
+    </w:p>
+    <w:p>
+      <w:pPr>
+        <w:pStyle w:val="ListParagraph"/>
+        <w:numPr>
+          <w:ilvl w:val="3"/>
+          <w:numId w:val="1"/>
+        </w:numPr>
+      </w:pPr>
+      <w:r>
+        <w:t>$</w:t>
+      </w:r>
+      <w:proofErr w:type="gramStart"/>
+      <w:r>
+        <w:t>state(</w:t>
+      </w:r>
+      <w:proofErr w:type="gramEnd"/>
+      <w:r>
+        <w:t>0) provides hint to svelte compiler that count variable will be converted to Signal</w:t>
+      </w:r>
+      <w:r>
+        <w:t>.</w:t>
+      </w:r>
+    </w:p>
+    <w:p>
+      <w:pPr>
+        <w:pStyle w:val="ListParagraph"/>
+        <w:numPr>
+          <w:ilvl w:val="1"/>
+          <w:numId w:val="1"/>
+        </w:numPr>
+      </w:pPr>
+      <w:r>
+        <w:t>How to bind value in svelte</w:t>
+      </w:r>
+    </w:p>
+    <w:p>
+      <w:pPr>
+        <w:pStyle w:val="ListParagraph"/>
+        <w:numPr>
+          <w:ilvl w:val="2"/>
+          <w:numId w:val="1"/>
+        </w:numPr>
+      </w:pPr>
+      <w:r>
+        <w:t xml:space="preserve">&lt;input type=”text” </w:t>
+      </w:r>
+      <w:proofErr w:type="spellStart"/>
+      <w:r>
+        <w:t>bind:value</w:t>
+      </w:r>
+      <w:proofErr w:type="spellEnd"/>
+      <w:r>
+        <w:t>={count} /&gt; OR</w:t>
+      </w:r>
+    </w:p>
+    <w:p>
+      <w:pPr>
+        <w:pStyle w:val="ListParagraph"/>
+        <w:numPr>
+          <w:ilvl w:val="2"/>
+          <w:numId w:val="1"/>
+        </w:numPr>
+      </w:pPr>
+      <w:r>
+        <w:t>&lt;div&gt; {count} &lt;/div&gt;</w:t>
+      </w:r>
+    </w:p>
+    <w:p>
+      <w:pPr>
+        <w:pStyle w:val="ListParagraph"/>
+        <w:numPr>
+          <w:ilvl w:val="0"/>
+          <w:numId w:val="1"/>
+        </w:numPr>
+      </w:pPr>
+    </w:p>
+    <w:p>
+      <w:pPr>
+        <w:pStyle w:val="ListParagraph"/>
+        <w:numPr>
+          <w:ilvl w:val="1"/>
+          <w:numId w:val="1"/>
+        </w:numPr>
+      </w:pPr>
+    </w:p>
+    <w:p/>
+    <w:p/>
+    <w:p/>
+    <w:p/>
+    <w:p/>
+    <w:p/>
+    <w:p/>
+    <w:p/>
+    <w:p/>
+    <w:p/>
+    <w:p/>
+    <w:p/>
+    <w:p/>
+    <w:p/>
+    <w:p/>
+    <w:p/>
+    <w:p/>
+    <w:p/>
+    <w:p/>
+    <w:p/>
+    <w:p/>
+    <w:p/>
+    <w:p/>
+    <w:p/>
+    <w:p>
+      <w:r>
+        <w:t xml:space="preserve">References: </w:t>
+      </w:r>
+    </w:p>
+    <w:p>
+      <w:pPr>
+        <w:pStyle w:val="ListParagraph"/>
+        <w:numPr>
+          <w:ilvl w:val="0"/>
+          <w:numId w:val="4"/>
+        </w:numPr>
+        <w:rPr>
+          <w:b/>
+          <w:bCs/>
+        </w:rPr>
+      </w:pPr>
+      <w:hyperlink r:id="rId10" w:history="1">
+        <w:r>
+          <w:rPr>
+            <w:rStyle w:val="Hyperlink"/>
+            <w:b/>
+            <w:bCs/>
+          </w:rPr>
+          <w:t xml:space="preserve">7 Projects </w:t>
+        </w:r>
+        <w:proofErr w:type="gramStart"/>
+        <w:r>
+          <w:rPr>
+            <w:rStyle w:val="Hyperlink"/>
+            <w:b/>
+            <w:bCs/>
+          </w:rPr>
+          <w:t>To</w:t>
+        </w:r>
+        <w:proofErr w:type="gramEnd"/>
+        <w:r>
+          <w:rPr>
+            <w:rStyle w:val="Hyperlink"/>
+            <w:b/>
+            <w:bCs/>
+          </w:rPr>
+          <w:t xml:space="preserve"> Learn Svelte 5</w:t>
+        </w:r>
+      </w:hyperlink>
+    </w:p>
+    <w:p/>
+    <w:p/>
+    <w:p/>
+    <w:p/>
+    <w:p/>
+    <w:p/>
+    <w:p/>
+    <w:p/>
+    <w:p/>
+    <w:p/>
+    <w:p/>
     <w:sectPr>
       <w:pgSz w:w="12240" w:h="15840"/>
       <w:pgMar w:top="1440" w:right="1440" w:bottom="1440" w:left="1440" w:header="720" w:footer="720" w:gutter="0"/>
@@ -722,7 +1095,7 @@
         <w:ind w:left="2160" w:hanging="180"/>
       </w:pPr>
     </w:lvl>
-    <w:lvl w:ilvl="3" w:tplc="0409000F" w:tentative="1">
+    <w:lvl w:ilvl="3" w:tplc="0409000F">
       <w:start w:val="1"/>
       <w:numFmt w:val="decimal"/>
       <w:lvlText w:val="%4."/>
@@ -950,6 +1323,119 @@
       <w:pPr>
         <w:ind w:left="6480" w:hanging="180"/>
       </w:pPr>
+    </w:lvl>
+  </w:abstractNum>
+  <w:abstractNum w:abstractNumId="3" w15:restartNumberingAfterBreak="0">
+    <w:nsid w:val="76531165"/>
+    <w:multiLevelType w:val="hybridMultilevel"/>
+    <w:tmpl w:val="1A8239EE"/>
+    <w:lvl w:ilvl="0" w:tplc="04090001">
+      <w:start w:val="1"/>
+      <w:numFmt w:val="bullet"/>
+      <w:lvlText w:val=""/>
+      <w:lvlJc w:val="left"/>
+      <w:pPr>
+        <w:ind w:left="720" w:hanging="360"/>
+      </w:pPr>
+      <w:rPr>
+        <w:rFonts w:ascii="Symbol" w:hAnsi="Symbol" w:hint="default"/>
+      </w:rPr>
+    </w:lvl>
+    <w:lvl w:ilvl="1" w:tplc="04090003" w:tentative="1">
+      <w:start w:val="1"/>
+      <w:numFmt w:val="bullet"/>
+      <w:lvlText w:val="o"/>
+      <w:lvlJc w:val="left"/>
+      <w:pPr>
+        <w:ind w:left="1440" w:hanging="360"/>
+      </w:pPr>
+      <w:rPr>
+        <w:rFonts w:ascii="Courier New" w:hAnsi="Courier New" w:cs="Courier New" w:hint="default"/>
+      </w:rPr>
+    </w:lvl>
+    <w:lvl w:ilvl="2" w:tplc="04090005" w:tentative="1">
+      <w:start w:val="1"/>
+      <w:numFmt w:val="bullet"/>
+      <w:lvlText w:val=""/>
+      <w:lvlJc w:val="left"/>
+      <w:pPr>
+        <w:ind w:left="2160" w:hanging="360"/>
+      </w:pPr>
+      <w:rPr>
+        <w:rFonts w:ascii="Wingdings" w:hAnsi="Wingdings" w:hint="default"/>
+      </w:rPr>
+    </w:lvl>
+    <w:lvl w:ilvl="3" w:tplc="04090001" w:tentative="1">
+      <w:start w:val="1"/>
+      <w:numFmt w:val="bullet"/>
+      <w:lvlText w:val=""/>
+      <w:lvlJc w:val="left"/>
+      <w:pPr>
+        <w:ind w:left="2880" w:hanging="360"/>
+      </w:pPr>
+      <w:rPr>
+        <w:rFonts w:ascii="Symbol" w:hAnsi="Symbol" w:hint="default"/>
+      </w:rPr>
+    </w:lvl>
+    <w:lvl w:ilvl="4" w:tplc="04090003" w:tentative="1">
+      <w:start w:val="1"/>
+      <w:numFmt w:val="bullet"/>
+      <w:lvlText w:val="o"/>
+      <w:lvlJc w:val="left"/>
+      <w:pPr>
+        <w:ind w:left="3600" w:hanging="360"/>
+      </w:pPr>
+      <w:rPr>
+        <w:rFonts w:ascii="Courier New" w:hAnsi="Courier New" w:cs="Courier New" w:hint="default"/>
+      </w:rPr>
+    </w:lvl>
+    <w:lvl w:ilvl="5" w:tplc="04090005" w:tentative="1">
+      <w:start w:val="1"/>
+      <w:numFmt w:val="bullet"/>
+      <w:lvlText w:val=""/>
+      <w:lvlJc w:val="left"/>
+      <w:pPr>
+        <w:ind w:left="4320" w:hanging="360"/>
+      </w:pPr>
+      <w:rPr>
+        <w:rFonts w:ascii="Wingdings" w:hAnsi="Wingdings" w:hint="default"/>
+      </w:rPr>
+    </w:lvl>
+    <w:lvl w:ilvl="6" w:tplc="04090001" w:tentative="1">
+      <w:start w:val="1"/>
+      <w:numFmt w:val="bullet"/>
+      <w:lvlText w:val=""/>
+      <w:lvlJc w:val="left"/>
+      <w:pPr>
+        <w:ind w:left="5040" w:hanging="360"/>
+      </w:pPr>
+      <w:rPr>
+        <w:rFonts w:ascii="Symbol" w:hAnsi="Symbol" w:hint="default"/>
+      </w:rPr>
+    </w:lvl>
+    <w:lvl w:ilvl="7" w:tplc="04090003" w:tentative="1">
+      <w:start w:val="1"/>
+      <w:numFmt w:val="bullet"/>
+      <w:lvlText w:val="o"/>
+      <w:lvlJc w:val="left"/>
+      <w:pPr>
+        <w:ind w:left="5760" w:hanging="360"/>
+      </w:pPr>
+      <w:rPr>
+        <w:rFonts w:ascii="Courier New" w:hAnsi="Courier New" w:cs="Courier New" w:hint="default"/>
+      </w:rPr>
+    </w:lvl>
+    <w:lvl w:ilvl="8" w:tplc="04090005" w:tentative="1">
+      <w:start w:val="1"/>
+      <w:numFmt w:val="bullet"/>
+      <w:lvlText w:val=""/>
+      <w:lvlJc w:val="left"/>
+      <w:pPr>
+        <w:ind w:left="6480" w:hanging="360"/>
+      </w:pPr>
+      <w:rPr>
+        <w:rFonts w:ascii="Wingdings" w:hAnsi="Wingdings" w:hint="default"/>
+      </w:rPr>
     </w:lvl>
   </w:abstractNum>
   <w:num w:numId="1" w16cid:durableId="1924801291">
@@ -960,6 +1446,9 @@
   </w:num>
   <w:num w:numId="3" w16cid:durableId="768818178">
     <w:abstractNumId w:val="1"/>
+  </w:num>
+  <w:num w:numId="4" w16cid:durableId="1832939526">
+    <w:abstractNumId w:val="3"/>
   </w:num>
 </w:numbering>
 </file>

</xml_diff>